<commit_message>
Update documentation for user roles, groups, and modules in the database schema
</commit_message>
<xml_diff>
--- a/database/cmc description.docx
+++ b/database/cmc description.docx
@@ -44,7 +44,7 @@
           <w:i/>
           <w:iCs/>
         </w:rPr>
-        <w:t>Numéro d’Utilisateur</w:t>
+        <w:t>Identifiant</w:t>
       </w:r>
       <w:r>
         <w:t>.</w:t>
@@ -101,7 +101,7 @@
         <w:t>Rôle</w:t>
       </w:r>
       <w:r>
-        <w:t xml:space="preserve"> (Directeur pédagogique, Chef de pôle ou Formateur).</w:t>
+        <w:t xml:space="preserve"> (DIRECTEUR, CHEF_POLE ou FORMATEUR).</w:t>
       </w:r>
     </w:p>
     <w:p>
@@ -110,7 +110,7 @@
       </w:r>
       <w:r>
         <w:br/>
-        <w:t>Tous les rôles gérés correspondent aux différents niveaux de responsabilité au sein du centre.</w:t>
+        <w:t>Les rôles correspondent aux différents niveaux de responsabilité au sein du centre.</w:t>
       </w:r>
     </w:p>
     <w:p>
@@ -136,7 +136,7 @@
           <w:i/>
           <w:iCs/>
         </w:rPr>
-        <w:t>Numéro de Pôle</w:t>
+        <w:t>Identifiant</w:t>
       </w:r>
       <w:r>
         <w:t xml:space="preserve"> et un </w:t>
@@ -154,7 +154,7 @@
     </w:p>
     <w:p>
       <w:r>
-        <w:t xml:space="preserve">Chaque pôle est dirigé par un </w:t>
+        <w:t xml:space="preserve">Chaque pôle peut être dirigé par un </w:t>
       </w:r>
       <w:r>
         <w:rPr>
@@ -172,61 +172,138 @@
       </w:r>
       <w:r>
         <w:br/>
-        <w:t>Un pôle doit obligatoirement avoir un chef.</w:t>
-      </w:r>
-    </w:p>
-    <w:p>
-      <w:r>
-        <w:t xml:space="preserve">Chaque pôle propose une ou plusieurs </w:t>
+        <w:t>Un pôle peut exister sans chef (le champ peut être nul), mais un chef ne peut être affecté qu’à un seul pôle.</w:t>
+      </w:r>
+    </w:p>
+    <w:p>
+      <w:r>
+        <w:t xml:space="preserve">Chaque pôle dispose de plusieurs </w:t>
       </w:r>
       <w:r>
         <w:rPr>
           <w:b/>
           <w:bCs/>
         </w:rPr>
-        <w:t>Formations</w:t>
+        <w:t>Salles</w:t>
+      </w:r>
+      <w:r>
+        <w:t xml:space="preserve"> ou </w:t>
+      </w:r>
+      <w:r>
+        <w:rPr>
+          <w:b/>
+          <w:bCs/>
+        </w:rPr>
+        <w:t>Ateliers</w:t>
       </w:r>
       <w:r>
         <w:t>.</w:t>
       </w:r>
       <w:r>
         <w:br/>
-        <w:t xml:space="preserve">Une formation est identifiée par un </w:t>
+        <w:t xml:space="preserve">Chaque salle est identifiée par un </w:t>
       </w:r>
       <w:r>
         <w:rPr>
           <w:i/>
           <w:iCs/>
         </w:rPr>
-        <w:t>Numéro de Formation</w:t>
-      </w:r>
-      <w:r>
-        <w:t xml:space="preserve"> et un </w:t>
+        <w:t>Identifiant</w:t>
+      </w:r>
+      <w:r>
+        <w:t xml:space="preserve">, un </w:t>
       </w:r>
       <w:r>
         <w:rPr>
           <w:i/>
           <w:iCs/>
         </w:rPr>
-        <w:t>Nom de Formation</w:t>
-      </w:r>
-      <w:r>
-        <w:t>.</w:t>
+        <w:t>Nom de Salle</w:t>
+      </w:r>
+      <w:r>
+        <w:t xml:space="preserve"> et un </w:t>
+      </w:r>
+      <w:r>
+        <w:rPr>
+          <w:i/>
+          <w:iCs/>
+        </w:rPr>
+        <w:t>Type</w:t>
+      </w:r>
+      <w:r>
+        <w:t xml:space="preserve"> (SALLE ou ATELIER).</w:t>
+      </w:r>
+    </w:p>
+    <w:p>
+      <w:r>
+        <w:t>Une salle appartient obligatoirement à un seul pôle.</w:t>
       </w:r>
       <w:r>
         <w:br/>
-        <w:t>Une formation appartient obligatoirement à un seul pôle.</w:t>
-      </w:r>
-    </w:p>
-    <w:p>
-      <w:r>
-        <w:t xml:space="preserve">Chaque formation est composée d’un ou plusieurs </w:t>
+        <w:t>Un même nom de salle ne peut pas être répété dans le même pôle.</w:t>
+      </w:r>
+    </w:p>
+    <w:p>
+      <w:r>
+        <w:t>Une salle peut être utilisée pour plusieurs séances à des dates différentes,</w:t>
+      </w:r>
+      <w:r>
+        <w:br/>
+        <w:t>mais elle ne peut être occupée que par un seul groupe à la fois pour un même créneau horaire.</w:t>
+      </w:r>
+    </w:p>
+    <w:p>
+      <w:r>
+        <w:t xml:space="preserve">Chaque pôle propose une ou plusieurs </w:t>
       </w:r>
       <w:r>
         <w:rPr>
           <w:b/>
           <w:bCs/>
         </w:rPr>
+        <w:t>Filières</w:t>
+      </w:r>
+      <w:r>
+        <w:t xml:space="preserve"> (Formations).</w:t>
+      </w:r>
+      <w:r>
+        <w:br/>
+        <w:t xml:space="preserve">Une filière est identifiée par un </w:t>
+      </w:r>
+      <w:r>
+        <w:rPr>
+          <w:i/>
+          <w:iCs/>
+        </w:rPr>
+        <w:t>Identifiant</w:t>
+      </w:r>
+      <w:r>
+        <w:t xml:space="preserve"> et un </w:t>
+      </w:r>
+      <w:r>
+        <w:rPr>
+          <w:i/>
+          <w:iCs/>
+        </w:rPr>
+        <w:t>Nom de Formation</w:t>
+      </w:r>
+      <w:r>
+        <w:t>.</w:t>
+      </w:r>
+      <w:r>
+        <w:br/>
+        <w:t>Une filière appartient obligatoirement à un seul pôle.</w:t>
+      </w:r>
+    </w:p>
+    <w:p>
+      <w:r>
+        <w:t xml:space="preserve">Chaque filière est composée d’un ou plusieurs </w:t>
+      </w:r>
+      <w:r>
+        <w:rPr>
+          <w:b/>
+          <w:bCs/>
+        </w:rPr>
         <w:t>Groupes</w:t>
       </w:r>
       <w:r>
@@ -241,7 +318,7 @@
           <w:i/>
           <w:iCs/>
         </w:rPr>
-        <w:t>Numéro de Groupe</w:t>
+        <w:t>Identifiant</w:t>
       </w:r>
       <w:r>
         <w:t xml:space="preserve">, un </w:t>
@@ -254,420 +331,602 @@
         <w:t>Nom de Groupe</w:t>
       </w:r>
       <w:r>
-        <w:t xml:space="preserve"> et une </w:t>
+        <w:t xml:space="preserve">, une </w:t>
       </w:r>
       <w:r>
         <w:rPr>
           <w:i/>
           <w:iCs/>
         </w:rPr>
-        <w:t>Année de formation</w:t>
+        <w:t>Année</w:t>
+      </w:r>
+      <w:r>
+        <w:t xml:space="preserve">, un </w:t>
+      </w:r>
+      <w:r>
+        <w:rPr>
+          <w:i/>
+          <w:iCs/>
+        </w:rPr>
+        <w:t>Niveau</w:t>
+      </w:r>
+      <w:r>
+        <w:t xml:space="preserve"> et un </w:t>
+      </w:r>
+      <w:r>
+        <w:rPr>
+          <w:i/>
+          <w:iCs/>
+        </w:rPr>
+        <w:t>Créneau</w:t>
       </w:r>
       <w:r>
         <w:t>.</w:t>
       </w:r>
+    </w:p>
+    <w:p>
+      <w:r>
+        <w:t>Le niveau peut être : TS, T, Q, S, FQ, BP ou PC.</w:t>
+      </w:r>
       <w:r>
         <w:br/>
-        <w:t>Un groupe appartient obligatoirement à une seule formation.</w:t>
-      </w:r>
-      <w:r>
-        <w:br/>
-        <w:t>Il n’y a pas de formation sans groupe.</w:t>
-      </w:r>
-    </w:p>
-    <w:p>
-      <w:r>
-        <w:t xml:space="preserve">Chaque salle est identifiée par un </w:t>
+        <w:t>Le créneau peut être : CDJ (Cours du Jour) ou CDS (Cours du Soir).</w:t>
+      </w:r>
+    </w:p>
+    <w:p>
+      <w:r>
+        <w:t>Un groupe appartient obligatoirement à une seule filière.</w:t>
+      </w:r>
+    </w:p>
+    <w:p>
+      <w:r>
+        <w:t xml:space="preserve">Les filières sont composées de </w:t>
       </w:r>
       <w:r>
         <w:rPr>
           <w:b/>
           <w:bCs/>
         </w:rPr>
-        <w:t>Numéro de Salle</w:t>
+        <w:t>Modules</w:t>
+      </w:r>
+      <w:r>
+        <w:t>.</w:t>
+      </w:r>
+      <w:r>
+        <w:br/>
+        <w:t xml:space="preserve">Chaque module est identifié par un </w:t>
+      </w:r>
+      <w:r>
+        <w:rPr>
+          <w:i/>
+          <w:iCs/>
+        </w:rPr>
+        <w:t>Identifiant</w:t>
+      </w:r>
+      <w:r>
+        <w:t xml:space="preserve">, un </w:t>
+      </w:r>
+      <w:r>
+        <w:rPr>
+          <w:i/>
+          <w:iCs/>
+        </w:rPr>
+        <w:t>Nom de Module</w:t>
       </w:r>
       <w:r>
         <w:t xml:space="preserve"> et un </w:t>
+      </w:r>
+      <w:r>
+        <w:rPr>
+          <w:i/>
+          <w:iCs/>
+        </w:rPr>
+        <w:t>Volume Horaire</w:t>
+      </w:r>
+      <w:r>
+        <w:t>.</w:t>
+      </w:r>
+    </w:p>
+    <w:p>
+      <w:r>
+        <w:t>Un module appartient obligatoirement à une filière.</w:t>
+      </w:r>
+    </w:p>
+    <w:p>
+      <w:r>
+        <w:t xml:space="preserve">Les modules peuvent être assurés par un ou plusieurs </w:t>
       </w:r>
       <w:r>
         <w:rPr>
           <w:b/>
           <w:bCs/>
         </w:rPr>
-        <w:t>Nom de Salle</w:t>
+        <w:t>Formateurs</w:t>
       </w:r>
       <w:r>
         <w:t>.</w:t>
       </w:r>
-    </w:p>
-    <w:p>
-      <w:r>
-        <w:t xml:space="preserve">Chaque salle appartient obligatoirement à un seul </w:t>
+      <w:r>
+        <w:br/>
+        <w:t xml:space="preserve">La relation entre modules et formateurs est de type </w:t>
       </w:r>
       <w:r>
         <w:rPr>
           <w:b/>
           <w:bCs/>
         </w:rPr>
-        <w:t>Pôle</w:t>
-      </w:r>
+        <w:t>plusieurs-à-plusieurs</w:t>
+      </w:r>
+      <w:r>
+        <w:t xml:space="preserve">, gérée par la table </w:t>
+      </w:r>
+      <w:proofErr w:type="spellStart"/>
+      <w:r>
+        <w:t>module_formateur</w:t>
+      </w:r>
+      <w:proofErr w:type="spellEnd"/>
       <w:r>
         <w:t>.</w:t>
       </w:r>
-      <w:r>
-        <w:br/>
-        <w:t>Un pôle peut disposer de plusieurs salles.</w:t>
-      </w:r>
-    </w:p>
-    <w:p>
-      <w:r>
-        <w:t>Une salle peut être utilisée pour plusieurs séances à des dates différentes,</w:t>
-      </w:r>
-      <w:r>
-        <w:br/>
-        <w:t>mais elle ne peut être occupée que par un seul groupe à la fois pour un même créneau horaire.</w:t>
-      </w:r>
-    </w:p>
-    <w:p>
-      <w:r>
-        <w:t xml:space="preserve">Les formations sont composées de </w:t>
+    </w:p>
+    <w:p>
+      <w:r>
+        <w:t>Ainsi :</w:t>
+      </w:r>
+    </w:p>
+    <w:p>
+      <w:pPr>
+        <w:numPr>
+          <w:ilvl w:val="0"/>
+          <w:numId w:val="4"/>
+        </w:numPr>
+      </w:pPr>
+      <w:r>
+        <w:t>Un module peut être enseigné par plusieurs formateurs.</w:t>
+      </w:r>
+    </w:p>
+    <w:p>
+      <w:pPr>
+        <w:numPr>
+          <w:ilvl w:val="0"/>
+          <w:numId w:val="4"/>
+        </w:numPr>
+      </w:pPr>
+      <w:r>
+        <w:t>Un formateur peut enseigner plusieurs modules.</w:t>
+      </w:r>
+    </w:p>
+    <w:p>
+      <w:r>
+        <w:t xml:space="preserve">L’organisation des cours est gérée à travers les </w:t>
       </w:r>
       <w:r>
         <w:rPr>
           <w:b/>
           <w:bCs/>
         </w:rPr>
-        <w:t>Modules</w:t>
+        <w:t>Emplois du Temps</w:t>
       </w:r>
       <w:r>
         <w:t>.</w:t>
       </w:r>
-      <w:r>
-        <w:br/>
-        <w:t xml:space="preserve">Chaque module est identifié par un </w:t>
+    </w:p>
+    <w:p>
+      <w:r>
+        <w:lastRenderedPageBreak/>
+        <w:t>Chaque séance d’emploi du temps est identifiée par :</w:t>
+      </w:r>
+    </w:p>
+    <w:p>
+      <w:pPr>
+        <w:numPr>
+          <w:ilvl w:val="0"/>
+          <w:numId w:val="5"/>
+        </w:numPr>
+      </w:pPr>
+      <w:r>
+        <w:t xml:space="preserve">Un </w:t>
       </w:r>
       <w:r>
         <w:rPr>
           <w:i/>
           <w:iCs/>
         </w:rPr>
-        <w:t>Numéro de Module</w:t>
-      </w:r>
-      <w:r>
-        <w:t xml:space="preserve">, un </w:t>
+        <w:t>Numéro de Séance</w:t>
+      </w:r>
+    </w:p>
+    <w:p>
+      <w:pPr>
+        <w:numPr>
+          <w:ilvl w:val="0"/>
+          <w:numId w:val="5"/>
+        </w:numPr>
+      </w:pPr>
+      <w:r>
+        <w:t xml:space="preserve">Une </w:t>
       </w:r>
       <w:r>
         <w:rPr>
           <w:i/>
           <w:iCs/>
         </w:rPr>
-        <w:t>Nom de Module</w:t>
-      </w:r>
-      <w:r>
-        <w:t xml:space="preserve"> et un </w:t>
+        <w:t>Date</w:t>
+      </w:r>
+    </w:p>
+    <w:p>
+      <w:pPr>
+        <w:numPr>
+          <w:ilvl w:val="0"/>
+          <w:numId w:val="5"/>
+        </w:numPr>
+      </w:pPr>
+      <w:r>
+        <w:t xml:space="preserve">Une </w:t>
       </w:r>
       <w:r>
         <w:rPr>
           <w:i/>
           <w:iCs/>
         </w:rPr>
-        <w:t>Volume Horaire</w:t>
-      </w:r>
-      <w:r>
-        <w:t>.</w:t>
+        <w:t>Heure de début</w:t>
+      </w:r>
+    </w:p>
+    <w:p>
+      <w:pPr>
+        <w:numPr>
+          <w:ilvl w:val="0"/>
+          <w:numId w:val="5"/>
+        </w:numPr>
+      </w:pPr>
+      <w:r>
+        <w:t xml:space="preserve">Une </w:t>
+      </w:r>
+      <w:r>
+        <w:rPr>
+          <w:i/>
+          <w:iCs/>
+        </w:rPr>
+        <w:t>Heure de fin</w:t>
+      </w:r>
+    </w:p>
+    <w:p>
+      <w:r>
+        <w:t>Chaque séance concerne :</w:t>
+      </w:r>
+    </w:p>
+    <w:p>
+      <w:pPr>
+        <w:numPr>
+          <w:ilvl w:val="0"/>
+          <w:numId w:val="6"/>
+        </w:numPr>
+      </w:pPr>
+      <w:r>
+        <w:t>Un seul groupe</w:t>
+      </w:r>
+    </w:p>
+    <w:p>
+      <w:pPr>
+        <w:numPr>
+          <w:ilvl w:val="0"/>
+          <w:numId w:val="6"/>
+        </w:numPr>
+      </w:pPr>
+      <w:r>
+        <w:t>Un seul module</w:t>
+      </w:r>
+    </w:p>
+    <w:p>
+      <w:pPr>
+        <w:numPr>
+          <w:ilvl w:val="0"/>
+          <w:numId w:val="6"/>
+        </w:numPr>
+      </w:pPr>
+      <w:r>
+        <w:t>Un seul formateur</w:t>
+      </w:r>
+    </w:p>
+    <w:p>
+      <w:pPr>
+        <w:numPr>
+          <w:ilvl w:val="0"/>
+          <w:numId w:val="6"/>
+        </w:numPr>
+      </w:pPr>
+      <w:r>
+        <w:t>Une seule salle</w:t>
+      </w:r>
+    </w:p>
+    <w:p>
+      <w:r>
+        <w:t>Un groupe ne peut avoir qu’une seule séance à la fois.</w:t>
       </w:r>
       <w:r>
         <w:br/>
-        <w:t>Un module appartient obligatoirement à une formation.</w:t>
-      </w:r>
-    </w:p>
-    <w:p>
-      <w:r>
-        <w:t xml:space="preserve">Chaque module est affecté à un </w:t>
-      </w:r>
-      <w:r>
+        <w:t>Un formateur ne peut assurer qu’une seule séance à la fois.</w:t>
+      </w:r>
+      <w:r>
+        <w:br/>
+        <w:t>Une salle ne peut accueillir qu’une seule séance à la fois.</w:t>
+      </w:r>
+    </w:p>
+    <w:p>
+      <w:r>
+        <w:t>Ces contraintes sont garanties par des règles d’unicité sur :</w:t>
+      </w:r>
+    </w:p>
+    <w:p>
+      <w:pPr>
+        <w:numPr>
+          <w:ilvl w:val="0"/>
+          <w:numId w:val="7"/>
+        </w:numPr>
+      </w:pPr>
+      <w:r>
+        <w:t>La salle</w:t>
+      </w:r>
+    </w:p>
+    <w:p>
+      <w:pPr>
+        <w:numPr>
+          <w:ilvl w:val="0"/>
+          <w:numId w:val="7"/>
+        </w:numPr>
+      </w:pPr>
+      <w:r>
+        <w:t>Le formateur</w:t>
+      </w:r>
+    </w:p>
+    <w:p>
+      <w:pPr>
+        <w:numPr>
+          <w:ilvl w:val="0"/>
+          <w:numId w:val="7"/>
+        </w:numPr>
+      </w:pPr>
+      <w:r>
+        <w:t>Le groupe</w:t>
+      </w:r>
+      <w:r>
+        <w:br/>
+        <w:t>pour une même date et un même intervalle horaire.</w:t>
+      </w:r>
+    </w:p>
+    <w:p>
+      <w:pPr>
         <w:rPr>
           <w:b/>
           <w:bCs/>
-        </w:rPr>
-        <w:t>Formateur</w:t>
-      </w:r>
-      <w:r>
-        <w:t>.</w:t>
-      </w:r>
-      <w:r>
-        <w:br/>
-        <w:t>Un formateur peut enseigner un ou plusieurs modules.</w:t>
-      </w:r>
-      <w:r>
-        <w:br/>
-        <w:t>Un module est assuré par un seul formateur.</w:t>
-      </w:r>
-    </w:p>
-    <w:p>
-      <w:r>
-        <w:t xml:space="preserve">L’organisation des cours est gérée à travers les </w:t>
-      </w:r>
+          <w:u w:val="single"/>
+        </w:rPr>
+      </w:pPr>
       <w:r>
         <w:rPr>
           <w:b/>
           <w:bCs/>
-        </w:rPr>
-        <w:t>Emplois du Temps</w:t>
-      </w:r>
-      <w:r>
-        <w:t>.</w:t>
-      </w:r>
-      <w:r>
-        <w:br/>
-        <w:t xml:space="preserve">Chaque séance d’emploi du temps est identifiée par un </w:t>
-      </w:r>
-      <w:r>
-        <w:rPr>
-          <w:i/>
-          <w:iCs/>
-        </w:rPr>
-        <w:t>Numéro de Séance</w:t>
-      </w:r>
-      <w:r>
-        <w:t xml:space="preserve">, une </w:t>
-      </w:r>
-      <w:r>
-        <w:rPr>
-          <w:i/>
-          <w:iCs/>
-        </w:rPr>
-        <w:t>Date</w:t>
-      </w:r>
-      <w:r>
-        <w:t xml:space="preserve">, une </w:t>
-      </w:r>
-      <w:r>
-        <w:rPr>
-          <w:i/>
-          <w:iCs/>
-        </w:rPr>
-        <w:t>Heure de début</w:t>
-      </w:r>
-      <w:r>
-        <w:t xml:space="preserve"> et une </w:t>
-      </w:r>
-      <w:r>
-        <w:rPr>
-          <w:i/>
-          <w:iCs/>
-        </w:rPr>
-        <w:t>Heure de fin</w:t>
-      </w:r>
-      <w:r>
-        <w:t>.</w:t>
-      </w:r>
-    </w:p>
-    <w:p>
-      <w:r>
-        <w:t>Chaque séance concerne :</w:t>
-      </w:r>
-    </w:p>
-    <w:p>
-      <w:pPr>
+          <w:u w:val="single"/>
+        </w:rPr>
+        <w:t>Responsabilités</w:t>
+      </w:r>
+    </w:p>
+    <w:p>
+      <w:pPr>
+        <w:pStyle w:val="Paragraphedeliste"/>
         <w:numPr>
           <w:ilvl w:val="0"/>
-          <w:numId w:val="1"/>
+          <w:numId w:val="11"/>
         </w:numPr>
-      </w:pPr>
-      <w:r>
-        <w:t>Un seul groupe</w:t>
+        <w:rPr>
+          <w:b/>
+          <w:bCs/>
+        </w:rPr>
+      </w:pPr>
+      <w:r>
+        <w:rPr>
+          <w:b/>
+          <w:bCs/>
+        </w:rPr>
+        <w:t>Directeur</w:t>
       </w:r>
     </w:p>
     <w:p>
       <w:pPr>
         <w:numPr>
           <w:ilvl w:val="0"/>
-          <w:numId w:val="1"/>
+          <w:numId w:val="8"/>
         </w:numPr>
-      </w:pPr>
-      <w:r>
-        <w:t>Un seul module</w:t>
+        <w:tabs>
+          <w:tab w:val="num" w:pos="720"/>
+        </w:tabs>
+      </w:pPr>
+      <w:r>
+        <w:t>Créer les pôles</w:t>
       </w:r>
     </w:p>
     <w:p>
       <w:pPr>
         <w:numPr>
           <w:ilvl w:val="0"/>
-          <w:numId w:val="1"/>
+          <w:numId w:val="8"/>
         </w:numPr>
-      </w:pPr>
-      <w:r>
-        <w:t>Un seul formateur</w:t>
+        <w:tabs>
+          <w:tab w:val="num" w:pos="720"/>
+        </w:tabs>
+      </w:pPr>
+      <w:r>
+        <w:t>Ajouter les salles et ateliers</w:t>
       </w:r>
     </w:p>
     <w:p>
       <w:pPr>
         <w:numPr>
           <w:ilvl w:val="0"/>
-          <w:numId w:val="1"/>
+          <w:numId w:val="8"/>
         </w:numPr>
-      </w:pPr>
-      <w:r>
-        <w:t>Une seule salle</w:t>
-      </w:r>
-    </w:p>
-    <w:p>
-      <w:r>
-        <w:lastRenderedPageBreak/>
-        <w:t>Un groupe ne peut avoir qu’une seule séance à la fois.</w:t>
-      </w:r>
-      <w:r>
-        <w:br/>
-        <w:t>Un formateur ne peut assurer qu’une seule séance à la fois.</w:t>
-      </w:r>
-      <w:r>
-        <w:br/>
-        <w:t>Une salle ne peut accueillir qu’une seule séance à la fois.</w:t>
-      </w:r>
-    </w:p>
-    <w:p>
-      <w:r>
-        <w:t xml:space="preserve">Le </w:t>
-      </w:r>
-      <w:r>
+        <w:tabs>
+          <w:tab w:val="num" w:pos="720"/>
+        </w:tabs>
+      </w:pPr>
+      <w:r>
+        <w:t>Nommer les chefs de pôle</w:t>
+      </w:r>
+    </w:p>
+    <w:p>
+      <w:pPr>
+        <w:numPr>
+          <w:ilvl w:val="0"/>
+          <w:numId w:val="8"/>
+        </w:numPr>
+        <w:tabs>
+          <w:tab w:val="num" w:pos="720"/>
+        </w:tabs>
+      </w:pPr>
+      <w:r>
+        <w:t>Superviser l’ensemble du système</w:t>
+      </w:r>
+    </w:p>
+    <w:p>
+      <w:pPr>
+        <w:pStyle w:val="Paragraphedeliste"/>
+        <w:numPr>
+          <w:ilvl w:val="0"/>
+          <w:numId w:val="11"/>
+        </w:numPr>
         <w:rPr>
           <w:b/>
           <w:bCs/>
         </w:rPr>
-        <w:t>Directeur pédagogique</w:t>
-      </w:r>
-      <w:r>
-        <w:t xml:space="preserve"> a la responsabilité de :</w:t>
+      </w:pPr>
+      <w:r>
+        <w:rPr>
+          <w:b/>
+          <w:bCs/>
+        </w:rPr>
+        <w:t>Chef de Pôle</w:t>
       </w:r>
     </w:p>
     <w:p>
       <w:pPr>
         <w:numPr>
           <w:ilvl w:val="0"/>
-          <w:numId w:val="2"/>
+          <w:numId w:val="9"/>
         </w:numPr>
-      </w:pPr>
-      <w:r>
-        <w:t>Créer les pôles</w:t>
+        <w:tabs>
+          <w:tab w:val="num" w:pos="720"/>
+        </w:tabs>
+      </w:pPr>
+      <w:r>
+        <w:t>Créer les filières</w:t>
       </w:r>
     </w:p>
     <w:p>
       <w:pPr>
         <w:numPr>
           <w:ilvl w:val="0"/>
-          <w:numId w:val="2"/>
+          <w:numId w:val="9"/>
         </w:numPr>
-      </w:pPr>
-      <w:r>
-        <w:t>Ajouter les salles et ateliers</w:t>
+        <w:tabs>
+          <w:tab w:val="num" w:pos="720"/>
+        </w:tabs>
+      </w:pPr>
+      <w:r>
+        <w:t>Ajouter les groupes</w:t>
       </w:r>
     </w:p>
     <w:p>
       <w:pPr>
         <w:numPr>
           <w:ilvl w:val="0"/>
-          <w:numId w:val="2"/>
+          <w:numId w:val="9"/>
         </w:numPr>
-      </w:pPr>
-      <w:r>
-        <w:t>Nommer les chefs de pôle</w:t>
+        <w:tabs>
+          <w:tab w:val="num" w:pos="720"/>
+        </w:tabs>
+      </w:pPr>
+      <w:r>
+        <w:t>Créer les modules</w:t>
       </w:r>
     </w:p>
     <w:p>
       <w:pPr>
         <w:numPr>
           <w:ilvl w:val="0"/>
-          <w:numId w:val="2"/>
+          <w:numId w:val="9"/>
         </w:numPr>
-      </w:pPr>
-      <w:r>
-        <w:t>Superviser tous les emplois du temps</w:t>
-      </w:r>
-    </w:p>
-    <w:p>
-      <w:r>
-        <w:t xml:space="preserve">Les </w:t>
-      </w:r>
-      <w:r>
-        <w:rPr>
+        <w:tabs>
+          <w:tab w:val="num" w:pos="720"/>
+        </w:tabs>
+      </w:pPr>
+      <w:r>
+        <w:t>Associer les modules aux formateurs</w:t>
+      </w:r>
+    </w:p>
+    <w:p>
+      <w:pPr>
+        <w:numPr>
+          <w:ilvl w:val="0"/>
+          <w:numId w:val="9"/>
+        </w:numPr>
+        <w:tabs>
+          <w:tab w:val="num" w:pos="720"/>
+        </w:tabs>
+      </w:pPr>
+      <w:r>
+        <w:t>Organiser les emplois du temps de son pôle</w:t>
+      </w:r>
+    </w:p>
+    <w:p>
+      <w:pPr>
+        <w:rPr>
+          <w:rFonts w:ascii="Segoe UI Emoji" w:hAnsi="Segoe UI Emoji" w:cs="Segoe UI Emoji"/>
           <w:b/>
           <w:bCs/>
         </w:rPr>
-        <w:t>Chefs de Pôle</w:t>
-      </w:r>
-      <w:r>
-        <w:t xml:space="preserve"> sont responsables de :</w:t>
-      </w:r>
-    </w:p>
-    <w:p>
-      <w:pPr>
+      </w:pPr>
+    </w:p>
+    <w:p>
+      <w:pPr>
+        <w:rPr>
+          <w:rFonts w:ascii="Segoe UI Emoji" w:hAnsi="Segoe UI Emoji" w:cs="Segoe UI Emoji"/>
+          <w:b/>
+          <w:bCs/>
+        </w:rPr>
+      </w:pPr>
+    </w:p>
+    <w:p>
+      <w:pPr>
+        <w:pStyle w:val="Paragraphedeliste"/>
         <w:numPr>
           <w:ilvl w:val="0"/>
-          <w:numId w:val="3"/>
+          <w:numId w:val="11"/>
         </w:numPr>
-      </w:pPr>
-      <w:r>
-        <w:t>Créer les formations</w:t>
+        <w:rPr>
+          <w:b/>
+          <w:bCs/>
+        </w:rPr>
+      </w:pPr>
+      <w:r>
+        <w:rPr>
+          <w:b/>
+          <w:bCs/>
+        </w:rPr>
+        <w:lastRenderedPageBreak/>
+        <w:t>Formateur</w:t>
       </w:r>
     </w:p>
     <w:p>
       <w:pPr>
         <w:numPr>
           <w:ilvl w:val="0"/>
-          <w:numId w:val="3"/>
+          <w:numId w:val="10"/>
         </w:numPr>
-      </w:pPr>
-      <w:r>
-        <w:t>Ajouter les groupes</w:t>
-      </w:r>
-    </w:p>
-    <w:p>
-      <w:pPr>
-        <w:numPr>
-          <w:ilvl w:val="0"/>
-          <w:numId w:val="3"/>
-        </w:numPr>
-      </w:pPr>
-      <w:r>
-        <w:t>Créer les modules</w:t>
-      </w:r>
-    </w:p>
-    <w:p>
-      <w:pPr>
-        <w:numPr>
-          <w:ilvl w:val="0"/>
-          <w:numId w:val="3"/>
-        </w:numPr>
-      </w:pPr>
-      <w:r>
-        <w:t>Affecter les modules aux formateurs</w:t>
-      </w:r>
-    </w:p>
-    <w:p>
-      <w:pPr>
-        <w:numPr>
-          <w:ilvl w:val="0"/>
-          <w:numId w:val="3"/>
-        </w:numPr>
-      </w:pPr>
-      <w:r>
-        <w:t>Organiser les emplois du temps des groupes de leur pôle</w:t>
-      </w:r>
-    </w:p>
-    <w:p>
-      <w:r>
-        <w:t xml:space="preserve">Les </w:t>
-      </w:r>
-      <w:r>
-        <w:rPr>
-          <w:b/>
-          <w:bCs/>
-        </w:rPr>
-        <w:t>Formateurs</w:t>
-      </w:r>
-      <w:r>
-        <w:t xml:space="preserve"> peuvent uniquement consulter leur emploi du temps personnel.</w:t>
+        <w:tabs>
+          <w:tab w:val="num" w:pos="720"/>
+        </w:tabs>
+      </w:pPr>
+      <w:r>
+        <w:t>Consulter uniquement son emploi du temps</w:t>
       </w:r>
     </w:p>
     <w:p/>
@@ -701,10 +960,10 @@
     <w:p>
       <w:r>
         <w:drawing>
-          <wp:inline distT="0" distB="0" distL="0" distR="0" wp14:anchorId="6FDEBC17" wp14:editId="258190C9">
-            <wp:extent cx="5760720" cy="3380740"/>
-            <wp:effectExtent l="0" t="0" r="0" b="0"/>
-            <wp:docPr id="989431683" name="Image 1"/>
+          <wp:inline distT="0" distB="0" distL="0" distR="0" wp14:anchorId="5365FC08" wp14:editId="6BC05C1B">
+            <wp:extent cx="5760720" cy="2835275"/>
+            <wp:effectExtent l="0" t="0" r="0" b="3175"/>
+            <wp:docPr id="2066105762" name="Image 1"/>
             <wp:cNvGraphicFramePr>
               <a:graphicFrameLocks xmlns:a="http://schemas.openxmlformats.org/drawingml/2006/main" noChangeAspect="1"/>
             </wp:cNvGraphicFramePr>
@@ -712,11 +971,12 @@
               <a:graphicData uri="http://schemas.openxmlformats.org/drawingml/2006/picture">
                 <pic:pic xmlns:pic="http://schemas.openxmlformats.org/drawingml/2006/picture">
                   <pic:nvPicPr>
-                    <pic:cNvPr id="989431683" name=""/>
+                    <pic:cNvPr id="2066105762" name=""/>
                     <pic:cNvPicPr/>
                   </pic:nvPicPr>
-                  <pic:blipFill>
+                  <pic:blipFill rotWithShape="1">
                     <a:blip r:embed="rId5"/>
+                    <a:srcRect r="4706"/>
                     <a:stretch>
                       <a:fillRect/>
                     </a:stretch>
@@ -724,7 +984,7 @@
                   <pic:spPr>
                     <a:xfrm>
                       <a:off x="0" y="0"/>
-                      <a:ext cx="5760720" cy="3380740"/>
+                      <a:ext cx="5760720" cy="2835275"/>
                     </a:xfrm>
                     <a:prstGeom prst="rect">
                       <a:avLst/>
@@ -750,6 +1010,304 @@
 <file path=word/numbering.xml><?xml version="1.0" encoding="utf-8"?>
 <w:numbering xmlns:wpc="http://schemas.microsoft.com/office/word/2010/wordprocessingCanvas" xmlns:cx="http://schemas.microsoft.com/office/drawing/2014/chartex" xmlns:cx1="http://schemas.microsoft.com/office/drawing/2015/9/8/chartex" xmlns:cx2="http://schemas.microsoft.com/office/drawing/2015/10/21/chartex" xmlns:cx3="http://schemas.microsoft.com/office/drawing/2016/5/9/chartex" xmlns:cx4="http://schemas.microsoft.com/office/drawing/2016/5/10/chartex" xmlns:cx5="http://schemas.microsoft.com/office/drawing/2016/5/11/chartex" xmlns:cx6="http://schemas.microsoft.com/office/drawing/2016/5/12/chartex" xmlns:cx7="http://schemas.microsoft.com/office/drawing/2016/5/13/chartex" xmlns:cx8="http://schemas.microsoft.com/office/drawing/2016/5/14/chartex" xmlns:mc="http://schemas.openxmlformats.org/markup-compatibility/2006" xmlns:aink="http://schemas.microsoft.com/office/drawing/2016/ink" xmlns:am3d="http://schemas.microsoft.com/office/drawing/2017/model3d" xmlns:o="urn:schemas-microsoft-com:office:office" xmlns:oel="http://schemas.microsoft.com/office/2019/extlst" xmlns:r="http://schemas.openxmlformats.org/officeDocument/2006/relationships" xmlns:m="http://schemas.openxmlformats.org/officeDocument/2006/math" xmlns:v="urn:schemas-microsoft-com:vml" xmlns:wp14="http://schemas.microsoft.com/office/word/2010/wordprocessingDrawing" xmlns:wp="http://schemas.openxmlformats.org/drawingml/2006/wordprocessingDrawing" xmlns:w10="urn:schemas-microsoft-com:office:word" xmlns:w="http://schemas.openxmlformats.org/wordprocessingml/2006/main" xmlns:w14="http://schemas.microsoft.com/office/word/2010/wordml" xmlns:w15="http://schemas.microsoft.com/office/word/2012/wordml" xmlns:w16cex="http://schemas.microsoft.com/office/word/2018/wordml/cex" xmlns:w16cid="http://schemas.microsoft.com/office/word/2016/wordml/cid" xmlns:w16="http://schemas.microsoft.com/office/word/2018/wordml" xmlns:w16du="http://schemas.microsoft.com/office/word/2023/wordml/word16du" xmlns:w16sdtdh="http://schemas.microsoft.com/office/word/2020/wordml/sdtdatahash" xmlns:w16sdtfl="http://schemas.microsoft.com/office/word/2024/wordml/sdtformatlock" xmlns:w16se="http://schemas.microsoft.com/office/word/2015/wordml/symex" xmlns:wpg="http://schemas.microsoft.com/office/word/2010/wordprocessingGroup" xmlns:wpi="http://schemas.microsoft.com/office/word/2010/wordprocessingInk" xmlns:wne="http://schemas.microsoft.com/office/word/2006/wordml" xmlns:wps="http://schemas.microsoft.com/office/word/2010/wordprocessingShape" mc:Ignorable="w14 w15 w16se w16cid w16 w16cex w16sdtdh w16sdtfl w16du wp14">
   <w:abstractNum w:abstractNumId="0" w15:restartNumberingAfterBreak="0">
+    <w:nsid w:val="03BB4F67"/>
+    <w:multiLevelType w:val="multilevel"/>
+    <w:tmpl w:val="F29253F8"/>
+    <w:lvl w:ilvl="0">
+      <w:start w:val="1"/>
+      <w:numFmt w:val="bullet"/>
+      <w:lvlText w:val=""/>
+      <w:lvlJc w:val="left"/>
+      <w:pPr>
+        <w:tabs>
+          <w:tab w:val="num" w:pos="720"/>
+        </w:tabs>
+        <w:ind w:left="720" w:hanging="360"/>
+      </w:pPr>
+      <w:rPr>
+        <w:rFonts w:ascii="Symbol" w:hAnsi="Symbol" w:hint="default"/>
+        <w:sz w:val="20"/>
+      </w:rPr>
+    </w:lvl>
+    <w:lvl w:ilvl="1" w:tentative="1">
+      <w:start w:val="1"/>
+      <w:numFmt w:val="bullet"/>
+      <w:lvlText w:val="o"/>
+      <w:lvlJc w:val="left"/>
+      <w:pPr>
+        <w:tabs>
+          <w:tab w:val="num" w:pos="1440"/>
+        </w:tabs>
+        <w:ind w:left="1440" w:hanging="360"/>
+      </w:pPr>
+      <w:rPr>
+        <w:rFonts w:ascii="Courier New" w:hAnsi="Courier New" w:hint="default"/>
+        <w:sz w:val="20"/>
+      </w:rPr>
+    </w:lvl>
+    <w:lvl w:ilvl="2" w:tentative="1">
+      <w:start w:val="1"/>
+      <w:numFmt w:val="bullet"/>
+      <w:lvlText w:val=""/>
+      <w:lvlJc w:val="left"/>
+      <w:pPr>
+        <w:tabs>
+          <w:tab w:val="num" w:pos="2160"/>
+        </w:tabs>
+        <w:ind w:left="2160" w:hanging="360"/>
+      </w:pPr>
+      <w:rPr>
+        <w:rFonts w:ascii="Wingdings" w:hAnsi="Wingdings" w:hint="default"/>
+        <w:sz w:val="20"/>
+      </w:rPr>
+    </w:lvl>
+    <w:lvl w:ilvl="3" w:tentative="1">
+      <w:start w:val="1"/>
+      <w:numFmt w:val="bullet"/>
+      <w:lvlText w:val=""/>
+      <w:lvlJc w:val="left"/>
+      <w:pPr>
+        <w:tabs>
+          <w:tab w:val="num" w:pos="2880"/>
+        </w:tabs>
+        <w:ind w:left="2880" w:hanging="360"/>
+      </w:pPr>
+      <w:rPr>
+        <w:rFonts w:ascii="Wingdings" w:hAnsi="Wingdings" w:hint="default"/>
+        <w:sz w:val="20"/>
+      </w:rPr>
+    </w:lvl>
+    <w:lvl w:ilvl="4" w:tentative="1">
+      <w:start w:val="1"/>
+      <w:numFmt w:val="bullet"/>
+      <w:lvlText w:val=""/>
+      <w:lvlJc w:val="left"/>
+      <w:pPr>
+        <w:tabs>
+          <w:tab w:val="num" w:pos="3600"/>
+        </w:tabs>
+        <w:ind w:left="3600" w:hanging="360"/>
+      </w:pPr>
+      <w:rPr>
+        <w:rFonts w:ascii="Wingdings" w:hAnsi="Wingdings" w:hint="default"/>
+        <w:sz w:val="20"/>
+      </w:rPr>
+    </w:lvl>
+    <w:lvl w:ilvl="5" w:tentative="1">
+      <w:start w:val="1"/>
+      <w:numFmt w:val="bullet"/>
+      <w:lvlText w:val=""/>
+      <w:lvlJc w:val="left"/>
+      <w:pPr>
+        <w:tabs>
+          <w:tab w:val="num" w:pos="4320"/>
+        </w:tabs>
+        <w:ind w:left="4320" w:hanging="360"/>
+      </w:pPr>
+      <w:rPr>
+        <w:rFonts w:ascii="Wingdings" w:hAnsi="Wingdings" w:hint="default"/>
+        <w:sz w:val="20"/>
+      </w:rPr>
+    </w:lvl>
+    <w:lvl w:ilvl="6" w:tentative="1">
+      <w:start w:val="1"/>
+      <w:numFmt w:val="bullet"/>
+      <w:lvlText w:val=""/>
+      <w:lvlJc w:val="left"/>
+      <w:pPr>
+        <w:tabs>
+          <w:tab w:val="num" w:pos="5040"/>
+        </w:tabs>
+        <w:ind w:left="5040" w:hanging="360"/>
+      </w:pPr>
+      <w:rPr>
+        <w:rFonts w:ascii="Wingdings" w:hAnsi="Wingdings" w:hint="default"/>
+        <w:sz w:val="20"/>
+      </w:rPr>
+    </w:lvl>
+    <w:lvl w:ilvl="7" w:tentative="1">
+      <w:start w:val="1"/>
+      <w:numFmt w:val="bullet"/>
+      <w:lvlText w:val=""/>
+      <w:lvlJc w:val="left"/>
+      <w:pPr>
+        <w:tabs>
+          <w:tab w:val="num" w:pos="5760"/>
+        </w:tabs>
+        <w:ind w:left="5760" w:hanging="360"/>
+      </w:pPr>
+      <w:rPr>
+        <w:rFonts w:ascii="Wingdings" w:hAnsi="Wingdings" w:hint="default"/>
+        <w:sz w:val="20"/>
+      </w:rPr>
+    </w:lvl>
+    <w:lvl w:ilvl="8" w:tentative="1">
+      <w:start w:val="1"/>
+      <w:numFmt w:val="bullet"/>
+      <w:lvlText w:val=""/>
+      <w:lvlJc w:val="left"/>
+      <w:pPr>
+        <w:tabs>
+          <w:tab w:val="num" w:pos="6480"/>
+        </w:tabs>
+        <w:ind w:left="6480" w:hanging="360"/>
+      </w:pPr>
+      <w:rPr>
+        <w:rFonts w:ascii="Wingdings" w:hAnsi="Wingdings" w:hint="default"/>
+        <w:sz w:val="20"/>
+      </w:rPr>
+    </w:lvl>
+  </w:abstractNum>
+  <w:abstractNum w:abstractNumId="1" w15:restartNumberingAfterBreak="0">
+    <w:nsid w:val="110949FD"/>
+    <w:multiLevelType w:val="multilevel"/>
+    <w:tmpl w:val="5A26D8DE"/>
+    <w:lvl w:ilvl="0">
+      <w:start w:val="1"/>
+      <w:numFmt w:val="bullet"/>
+      <w:lvlText w:val=""/>
+      <w:lvlJc w:val="left"/>
+      <w:pPr>
+        <w:tabs>
+          <w:tab w:val="num" w:pos="720"/>
+        </w:tabs>
+        <w:ind w:left="720" w:hanging="360"/>
+      </w:pPr>
+      <w:rPr>
+        <w:rFonts w:ascii="Symbol" w:hAnsi="Symbol" w:hint="default"/>
+        <w:sz w:val="20"/>
+      </w:rPr>
+    </w:lvl>
+    <w:lvl w:ilvl="1" w:tentative="1">
+      <w:start w:val="1"/>
+      <w:numFmt w:val="bullet"/>
+      <w:lvlText w:val="o"/>
+      <w:lvlJc w:val="left"/>
+      <w:pPr>
+        <w:tabs>
+          <w:tab w:val="num" w:pos="1440"/>
+        </w:tabs>
+        <w:ind w:left="1440" w:hanging="360"/>
+      </w:pPr>
+      <w:rPr>
+        <w:rFonts w:ascii="Courier New" w:hAnsi="Courier New" w:hint="default"/>
+        <w:sz w:val="20"/>
+      </w:rPr>
+    </w:lvl>
+    <w:lvl w:ilvl="2" w:tentative="1">
+      <w:start w:val="1"/>
+      <w:numFmt w:val="bullet"/>
+      <w:lvlText w:val=""/>
+      <w:lvlJc w:val="left"/>
+      <w:pPr>
+        <w:tabs>
+          <w:tab w:val="num" w:pos="2160"/>
+        </w:tabs>
+        <w:ind w:left="2160" w:hanging="360"/>
+      </w:pPr>
+      <w:rPr>
+        <w:rFonts w:ascii="Wingdings" w:hAnsi="Wingdings" w:hint="default"/>
+        <w:sz w:val="20"/>
+      </w:rPr>
+    </w:lvl>
+    <w:lvl w:ilvl="3" w:tentative="1">
+      <w:start w:val="1"/>
+      <w:numFmt w:val="bullet"/>
+      <w:lvlText w:val=""/>
+      <w:lvlJc w:val="left"/>
+      <w:pPr>
+        <w:tabs>
+          <w:tab w:val="num" w:pos="2880"/>
+        </w:tabs>
+        <w:ind w:left="2880" w:hanging="360"/>
+      </w:pPr>
+      <w:rPr>
+        <w:rFonts w:ascii="Wingdings" w:hAnsi="Wingdings" w:hint="default"/>
+        <w:sz w:val="20"/>
+      </w:rPr>
+    </w:lvl>
+    <w:lvl w:ilvl="4" w:tentative="1">
+      <w:start w:val="1"/>
+      <w:numFmt w:val="bullet"/>
+      <w:lvlText w:val=""/>
+      <w:lvlJc w:val="left"/>
+      <w:pPr>
+        <w:tabs>
+          <w:tab w:val="num" w:pos="3600"/>
+        </w:tabs>
+        <w:ind w:left="3600" w:hanging="360"/>
+      </w:pPr>
+      <w:rPr>
+        <w:rFonts w:ascii="Wingdings" w:hAnsi="Wingdings" w:hint="default"/>
+        <w:sz w:val="20"/>
+      </w:rPr>
+    </w:lvl>
+    <w:lvl w:ilvl="5" w:tentative="1">
+      <w:start w:val="1"/>
+      <w:numFmt w:val="bullet"/>
+      <w:lvlText w:val=""/>
+      <w:lvlJc w:val="left"/>
+      <w:pPr>
+        <w:tabs>
+          <w:tab w:val="num" w:pos="4320"/>
+        </w:tabs>
+        <w:ind w:left="4320" w:hanging="360"/>
+      </w:pPr>
+      <w:rPr>
+        <w:rFonts w:ascii="Wingdings" w:hAnsi="Wingdings" w:hint="default"/>
+        <w:sz w:val="20"/>
+      </w:rPr>
+    </w:lvl>
+    <w:lvl w:ilvl="6" w:tentative="1">
+      <w:start w:val="1"/>
+      <w:numFmt w:val="bullet"/>
+      <w:lvlText w:val=""/>
+      <w:lvlJc w:val="left"/>
+      <w:pPr>
+        <w:tabs>
+          <w:tab w:val="num" w:pos="5040"/>
+        </w:tabs>
+        <w:ind w:left="5040" w:hanging="360"/>
+      </w:pPr>
+      <w:rPr>
+        <w:rFonts w:ascii="Wingdings" w:hAnsi="Wingdings" w:hint="default"/>
+        <w:sz w:val="20"/>
+      </w:rPr>
+    </w:lvl>
+    <w:lvl w:ilvl="7" w:tentative="1">
+      <w:start w:val="1"/>
+      <w:numFmt w:val="bullet"/>
+      <w:lvlText w:val=""/>
+      <w:lvlJc w:val="left"/>
+      <w:pPr>
+        <w:tabs>
+          <w:tab w:val="num" w:pos="5760"/>
+        </w:tabs>
+        <w:ind w:left="5760" w:hanging="360"/>
+      </w:pPr>
+      <w:rPr>
+        <w:rFonts w:ascii="Wingdings" w:hAnsi="Wingdings" w:hint="default"/>
+        <w:sz w:val="20"/>
+      </w:rPr>
+    </w:lvl>
+    <w:lvl w:ilvl="8" w:tentative="1">
+      <w:start w:val="1"/>
+      <w:numFmt w:val="bullet"/>
+      <w:lvlText w:val=""/>
+      <w:lvlJc w:val="left"/>
+      <w:pPr>
+        <w:tabs>
+          <w:tab w:val="num" w:pos="6480"/>
+        </w:tabs>
+        <w:ind w:left="6480" w:hanging="360"/>
+      </w:pPr>
+      <w:rPr>
+        <w:rFonts w:ascii="Wingdings" w:hAnsi="Wingdings" w:hint="default"/>
+        <w:sz w:val="20"/>
+      </w:rPr>
+    </w:lvl>
+  </w:abstractNum>
+  <w:abstractNum w:abstractNumId="2" w15:restartNumberingAfterBreak="0">
     <w:nsid w:val="2D2E74F7"/>
     <w:multiLevelType w:val="multilevel"/>
     <w:tmpl w:val="0B90F2A0"/>
@@ -898,7 +1456,454 @@
       </w:rPr>
     </w:lvl>
   </w:abstractNum>
-  <w:abstractNum w:abstractNumId="1" w15:restartNumberingAfterBreak="0">
+  <w:abstractNum w:abstractNumId="3" w15:restartNumberingAfterBreak="0">
+    <w:nsid w:val="33674384"/>
+    <w:multiLevelType w:val="multilevel"/>
+    <w:tmpl w:val="C004EBAE"/>
+    <w:lvl w:ilvl="0">
+      <w:start w:val="1"/>
+      <w:numFmt w:val="bullet"/>
+      <w:lvlText w:val=""/>
+      <w:lvlJc w:val="left"/>
+      <w:pPr>
+        <w:tabs>
+          <w:tab w:val="num" w:pos="1068"/>
+        </w:tabs>
+        <w:ind w:left="1068" w:hanging="360"/>
+      </w:pPr>
+      <w:rPr>
+        <w:rFonts w:ascii="Symbol" w:hAnsi="Symbol" w:hint="default"/>
+        <w:sz w:val="20"/>
+      </w:rPr>
+    </w:lvl>
+    <w:lvl w:ilvl="1" w:tentative="1">
+      <w:start w:val="1"/>
+      <w:numFmt w:val="bullet"/>
+      <w:lvlText w:val="o"/>
+      <w:lvlJc w:val="left"/>
+      <w:pPr>
+        <w:tabs>
+          <w:tab w:val="num" w:pos="1788"/>
+        </w:tabs>
+        <w:ind w:left="1788" w:hanging="360"/>
+      </w:pPr>
+      <w:rPr>
+        <w:rFonts w:ascii="Courier New" w:hAnsi="Courier New" w:hint="default"/>
+        <w:sz w:val="20"/>
+      </w:rPr>
+    </w:lvl>
+    <w:lvl w:ilvl="2" w:tentative="1">
+      <w:start w:val="1"/>
+      <w:numFmt w:val="bullet"/>
+      <w:lvlText w:val=""/>
+      <w:lvlJc w:val="left"/>
+      <w:pPr>
+        <w:tabs>
+          <w:tab w:val="num" w:pos="2508"/>
+        </w:tabs>
+        <w:ind w:left="2508" w:hanging="360"/>
+      </w:pPr>
+      <w:rPr>
+        <w:rFonts w:ascii="Wingdings" w:hAnsi="Wingdings" w:hint="default"/>
+        <w:sz w:val="20"/>
+      </w:rPr>
+    </w:lvl>
+    <w:lvl w:ilvl="3" w:tentative="1">
+      <w:start w:val="1"/>
+      <w:numFmt w:val="bullet"/>
+      <w:lvlText w:val=""/>
+      <w:lvlJc w:val="left"/>
+      <w:pPr>
+        <w:tabs>
+          <w:tab w:val="num" w:pos="3228"/>
+        </w:tabs>
+        <w:ind w:left="3228" w:hanging="360"/>
+      </w:pPr>
+      <w:rPr>
+        <w:rFonts w:ascii="Wingdings" w:hAnsi="Wingdings" w:hint="default"/>
+        <w:sz w:val="20"/>
+      </w:rPr>
+    </w:lvl>
+    <w:lvl w:ilvl="4" w:tentative="1">
+      <w:start w:val="1"/>
+      <w:numFmt w:val="bullet"/>
+      <w:lvlText w:val=""/>
+      <w:lvlJc w:val="left"/>
+      <w:pPr>
+        <w:tabs>
+          <w:tab w:val="num" w:pos="3948"/>
+        </w:tabs>
+        <w:ind w:left="3948" w:hanging="360"/>
+      </w:pPr>
+      <w:rPr>
+        <w:rFonts w:ascii="Wingdings" w:hAnsi="Wingdings" w:hint="default"/>
+        <w:sz w:val="20"/>
+      </w:rPr>
+    </w:lvl>
+    <w:lvl w:ilvl="5" w:tentative="1">
+      <w:start w:val="1"/>
+      <w:numFmt w:val="bullet"/>
+      <w:lvlText w:val=""/>
+      <w:lvlJc w:val="left"/>
+      <w:pPr>
+        <w:tabs>
+          <w:tab w:val="num" w:pos="4668"/>
+        </w:tabs>
+        <w:ind w:left="4668" w:hanging="360"/>
+      </w:pPr>
+      <w:rPr>
+        <w:rFonts w:ascii="Wingdings" w:hAnsi="Wingdings" w:hint="default"/>
+        <w:sz w:val="20"/>
+      </w:rPr>
+    </w:lvl>
+    <w:lvl w:ilvl="6" w:tentative="1">
+      <w:start w:val="1"/>
+      <w:numFmt w:val="bullet"/>
+      <w:lvlText w:val=""/>
+      <w:lvlJc w:val="left"/>
+      <w:pPr>
+        <w:tabs>
+          <w:tab w:val="num" w:pos="5388"/>
+        </w:tabs>
+        <w:ind w:left="5388" w:hanging="360"/>
+      </w:pPr>
+      <w:rPr>
+        <w:rFonts w:ascii="Wingdings" w:hAnsi="Wingdings" w:hint="default"/>
+        <w:sz w:val="20"/>
+      </w:rPr>
+    </w:lvl>
+    <w:lvl w:ilvl="7" w:tentative="1">
+      <w:start w:val="1"/>
+      <w:numFmt w:val="bullet"/>
+      <w:lvlText w:val=""/>
+      <w:lvlJc w:val="left"/>
+      <w:pPr>
+        <w:tabs>
+          <w:tab w:val="num" w:pos="6108"/>
+        </w:tabs>
+        <w:ind w:left="6108" w:hanging="360"/>
+      </w:pPr>
+      <w:rPr>
+        <w:rFonts w:ascii="Wingdings" w:hAnsi="Wingdings" w:hint="default"/>
+        <w:sz w:val="20"/>
+      </w:rPr>
+    </w:lvl>
+    <w:lvl w:ilvl="8" w:tentative="1">
+      <w:start w:val="1"/>
+      <w:numFmt w:val="bullet"/>
+      <w:lvlText w:val=""/>
+      <w:lvlJc w:val="left"/>
+      <w:pPr>
+        <w:tabs>
+          <w:tab w:val="num" w:pos="6828"/>
+        </w:tabs>
+        <w:ind w:left="6828" w:hanging="360"/>
+      </w:pPr>
+      <w:rPr>
+        <w:rFonts w:ascii="Wingdings" w:hAnsi="Wingdings" w:hint="default"/>
+        <w:sz w:val="20"/>
+      </w:rPr>
+    </w:lvl>
+  </w:abstractNum>
+  <w:abstractNum w:abstractNumId="4" w15:restartNumberingAfterBreak="0">
+    <w:nsid w:val="3F97355F"/>
+    <w:multiLevelType w:val="multilevel"/>
+    <w:tmpl w:val="6C1837DE"/>
+    <w:lvl w:ilvl="0">
+      <w:start w:val="1"/>
+      <w:numFmt w:val="bullet"/>
+      <w:lvlText w:val=""/>
+      <w:lvlJc w:val="left"/>
+      <w:pPr>
+        <w:tabs>
+          <w:tab w:val="num" w:pos="1068"/>
+        </w:tabs>
+        <w:ind w:left="1068" w:hanging="360"/>
+      </w:pPr>
+      <w:rPr>
+        <w:rFonts w:ascii="Symbol" w:hAnsi="Symbol" w:hint="default"/>
+        <w:sz w:val="20"/>
+      </w:rPr>
+    </w:lvl>
+    <w:lvl w:ilvl="1" w:tentative="1">
+      <w:start w:val="1"/>
+      <w:numFmt w:val="bullet"/>
+      <w:lvlText w:val="o"/>
+      <w:lvlJc w:val="left"/>
+      <w:pPr>
+        <w:tabs>
+          <w:tab w:val="num" w:pos="1788"/>
+        </w:tabs>
+        <w:ind w:left="1788" w:hanging="360"/>
+      </w:pPr>
+      <w:rPr>
+        <w:rFonts w:ascii="Courier New" w:hAnsi="Courier New" w:hint="default"/>
+        <w:sz w:val="20"/>
+      </w:rPr>
+    </w:lvl>
+    <w:lvl w:ilvl="2" w:tentative="1">
+      <w:start w:val="1"/>
+      <w:numFmt w:val="bullet"/>
+      <w:lvlText w:val=""/>
+      <w:lvlJc w:val="left"/>
+      <w:pPr>
+        <w:tabs>
+          <w:tab w:val="num" w:pos="2508"/>
+        </w:tabs>
+        <w:ind w:left="2508" w:hanging="360"/>
+      </w:pPr>
+      <w:rPr>
+        <w:rFonts w:ascii="Wingdings" w:hAnsi="Wingdings" w:hint="default"/>
+        <w:sz w:val="20"/>
+      </w:rPr>
+    </w:lvl>
+    <w:lvl w:ilvl="3" w:tentative="1">
+      <w:start w:val="1"/>
+      <w:numFmt w:val="bullet"/>
+      <w:lvlText w:val=""/>
+      <w:lvlJc w:val="left"/>
+      <w:pPr>
+        <w:tabs>
+          <w:tab w:val="num" w:pos="3228"/>
+        </w:tabs>
+        <w:ind w:left="3228" w:hanging="360"/>
+      </w:pPr>
+      <w:rPr>
+        <w:rFonts w:ascii="Wingdings" w:hAnsi="Wingdings" w:hint="default"/>
+        <w:sz w:val="20"/>
+      </w:rPr>
+    </w:lvl>
+    <w:lvl w:ilvl="4" w:tentative="1">
+      <w:start w:val="1"/>
+      <w:numFmt w:val="bullet"/>
+      <w:lvlText w:val=""/>
+      <w:lvlJc w:val="left"/>
+      <w:pPr>
+        <w:tabs>
+          <w:tab w:val="num" w:pos="3948"/>
+        </w:tabs>
+        <w:ind w:left="3948" w:hanging="360"/>
+      </w:pPr>
+      <w:rPr>
+        <w:rFonts w:ascii="Wingdings" w:hAnsi="Wingdings" w:hint="default"/>
+        <w:sz w:val="20"/>
+      </w:rPr>
+    </w:lvl>
+    <w:lvl w:ilvl="5" w:tentative="1">
+      <w:start w:val="1"/>
+      <w:numFmt w:val="bullet"/>
+      <w:lvlText w:val=""/>
+      <w:lvlJc w:val="left"/>
+      <w:pPr>
+        <w:tabs>
+          <w:tab w:val="num" w:pos="4668"/>
+        </w:tabs>
+        <w:ind w:left="4668" w:hanging="360"/>
+      </w:pPr>
+      <w:rPr>
+        <w:rFonts w:ascii="Wingdings" w:hAnsi="Wingdings" w:hint="default"/>
+        <w:sz w:val="20"/>
+      </w:rPr>
+    </w:lvl>
+    <w:lvl w:ilvl="6" w:tentative="1">
+      <w:start w:val="1"/>
+      <w:numFmt w:val="bullet"/>
+      <w:lvlText w:val=""/>
+      <w:lvlJc w:val="left"/>
+      <w:pPr>
+        <w:tabs>
+          <w:tab w:val="num" w:pos="5388"/>
+        </w:tabs>
+        <w:ind w:left="5388" w:hanging="360"/>
+      </w:pPr>
+      <w:rPr>
+        <w:rFonts w:ascii="Wingdings" w:hAnsi="Wingdings" w:hint="default"/>
+        <w:sz w:val="20"/>
+      </w:rPr>
+    </w:lvl>
+    <w:lvl w:ilvl="7" w:tentative="1">
+      <w:start w:val="1"/>
+      <w:numFmt w:val="bullet"/>
+      <w:lvlText w:val=""/>
+      <w:lvlJc w:val="left"/>
+      <w:pPr>
+        <w:tabs>
+          <w:tab w:val="num" w:pos="6108"/>
+        </w:tabs>
+        <w:ind w:left="6108" w:hanging="360"/>
+      </w:pPr>
+      <w:rPr>
+        <w:rFonts w:ascii="Wingdings" w:hAnsi="Wingdings" w:hint="default"/>
+        <w:sz w:val="20"/>
+      </w:rPr>
+    </w:lvl>
+    <w:lvl w:ilvl="8" w:tentative="1">
+      <w:start w:val="1"/>
+      <w:numFmt w:val="bullet"/>
+      <w:lvlText w:val=""/>
+      <w:lvlJc w:val="left"/>
+      <w:pPr>
+        <w:tabs>
+          <w:tab w:val="num" w:pos="6828"/>
+        </w:tabs>
+        <w:ind w:left="6828" w:hanging="360"/>
+      </w:pPr>
+      <w:rPr>
+        <w:rFonts w:ascii="Wingdings" w:hAnsi="Wingdings" w:hint="default"/>
+        <w:sz w:val="20"/>
+      </w:rPr>
+    </w:lvl>
+  </w:abstractNum>
+  <w:abstractNum w:abstractNumId="5" w15:restartNumberingAfterBreak="0">
+    <w:nsid w:val="4E4F65A3"/>
+    <w:multiLevelType w:val="multilevel"/>
+    <w:tmpl w:val="D7627414"/>
+    <w:lvl w:ilvl="0">
+      <w:start w:val="1"/>
+      <w:numFmt w:val="bullet"/>
+      <w:lvlText w:val=""/>
+      <w:lvlJc w:val="left"/>
+      <w:pPr>
+        <w:tabs>
+          <w:tab w:val="num" w:pos="1068"/>
+        </w:tabs>
+        <w:ind w:left="1068" w:hanging="360"/>
+      </w:pPr>
+      <w:rPr>
+        <w:rFonts w:ascii="Symbol" w:hAnsi="Symbol" w:hint="default"/>
+        <w:sz w:val="20"/>
+      </w:rPr>
+    </w:lvl>
+    <w:lvl w:ilvl="1" w:tentative="1">
+      <w:start w:val="1"/>
+      <w:numFmt w:val="bullet"/>
+      <w:lvlText w:val="o"/>
+      <w:lvlJc w:val="left"/>
+      <w:pPr>
+        <w:tabs>
+          <w:tab w:val="num" w:pos="1788"/>
+        </w:tabs>
+        <w:ind w:left="1788" w:hanging="360"/>
+      </w:pPr>
+      <w:rPr>
+        <w:rFonts w:ascii="Courier New" w:hAnsi="Courier New" w:hint="default"/>
+        <w:sz w:val="20"/>
+      </w:rPr>
+    </w:lvl>
+    <w:lvl w:ilvl="2" w:tentative="1">
+      <w:start w:val="1"/>
+      <w:numFmt w:val="bullet"/>
+      <w:lvlText w:val=""/>
+      <w:lvlJc w:val="left"/>
+      <w:pPr>
+        <w:tabs>
+          <w:tab w:val="num" w:pos="2508"/>
+        </w:tabs>
+        <w:ind w:left="2508" w:hanging="360"/>
+      </w:pPr>
+      <w:rPr>
+        <w:rFonts w:ascii="Wingdings" w:hAnsi="Wingdings" w:hint="default"/>
+        <w:sz w:val="20"/>
+      </w:rPr>
+    </w:lvl>
+    <w:lvl w:ilvl="3" w:tentative="1">
+      <w:start w:val="1"/>
+      <w:numFmt w:val="bullet"/>
+      <w:lvlText w:val=""/>
+      <w:lvlJc w:val="left"/>
+      <w:pPr>
+        <w:tabs>
+          <w:tab w:val="num" w:pos="3228"/>
+        </w:tabs>
+        <w:ind w:left="3228" w:hanging="360"/>
+      </w:pPr>
+      <w:rPr>
+        <w:rFonts w:ascii="Wingdings" w:hAnsi="Wingdings" w:hint="default"/>
+        <w:sz w:val="20"/>
+      </w:rPr>
+    </w:lvl>
+    <w:lvl w:ilvl="4" w:tentative="1">
+      <w:start w:val="1"/>
+      <w:numFmt w:val="bullet"/>
+      <w:lvlText w:val=""/>
+      <w:lvlJc w:val="left"/>
+      <w:pPr>
+        <w:tabs>
+          <w:tab w:val="num" w:pos="3948"/>
+        </w:tabs>
+        <w:ind w:left="3948" w:hanging="360"/>
+      </w:pPr>
+      <w:rPr>
+        <w:rFonts w:ascii="Wingdings" w:hAnsi="Wingdings" w:hint="default"/>
+        <w:sz w:val="20"/>
+      </w:rPr>
+    </w:lvl>
+    <w:lvl w:ilvl="5" w:tentative="1">
+      <w:start w:val="1"/>
+      <w:numFmt w:val="bullet"/>
+      <w:lvlText w:val=""/>
+      <w:lvlJc w:val="left"/>
+      <w:pPr>
+        <w:tabs>
+          <w:tab w:val="num" w:pos="4668"/>
+        </w:tabs>
+        <w:ind w:left="4668" w:hanging="360"/>
+      </w:pPr>
+      <w:rPr>
+        <w:rFonts w:ascii="Wingdings" w:hAnsi="Wingdings" w:hint="default"/>
+        <w:sz w:val="20"/>
+      </w:rPr>
+    </w:lvl>
+    <w:lvl w:ilvl="6" w:tentative="1">
+      <w:start w:val="1"/>
+      <w:numFmt w:val="bullet"/>
+      <w:lvlText w:val=""/>
+      <w:lvlJc w:val="left"/>
+      <w:pPr>
+        <w:tabs>
+          <w:tab w:val="num" w:pos="5388"/>
+        </w:tabs>
+        <w:ind w:left="5388" w:hanging="360"/>
+      </w:pPr>
+      <w:rPr>
+        <w:rFonts w:ascii="Wingdings" w:hAnsi="Wingdings" w:hint="default"/>
+        <w:sz w:val="20"/>
+      </w:rPr>
+    </w:lvl>
+    <w:lvl w:ilvl="7" w:tentative="1">
+      <w:start w:val="1"/>
+      <w:numFmt w:val="bullet"/>
+      <w:lvlText w:val=""/>
+      <w:lvlJc w:val="left"/>
+      <w:pPr>
+        <w:tabs>
+          <w:tab w:val="num" w:pos="6108"/>
+        </w:tabs>
+        <w:ind w:left="6108" w:hanging="360"/>
+      </w:pPr>
+      <w:rPr>
+        <w:rFonts w:ascii="Wingdings" w:hAnsi="Wingdings" w:hint="default"/>
+        <w:sz w:val="20"/>
+      </w:rPr>
+    </w:lvl>
+    <w:lvl w:ilvl="8" w:tentative="1">
+      <w:start w:val="1"/>
+      <w:numFmt w:val="bullet"/>
+      <w:lvlText w:val=""/>
+      <w:lvlJc w:val="left"/>
+      <w:pPr>
+        <w:tabs>
+          <w:tab w:val="num" w:pos="6828"/>
+        </w:tabs>
+        <w:ind w:left="6828" w:hanging="360"/>
+      </w:pPr>
+      <w:rPr>
+        <w:rFonts w:ascii="Wingdings" w:hAnsi="Wingdings" w:hint="default"/>
+        <w:sz w:val="20"/>
+      </w:rPr>
+    </w:lvl>
+  </w:abstractNum>
+  <w:abstractNum w:abstractNumId="6" w15:restartNumberingAfterBreak="0">
     <w:nsid w:val="55364483"/>
     <w:multiLevelType w:val="multilevel"/>
     <w:tmpl w:val="447EE1C8"/>
@@ -1047,7 +2052,269 @@
       </w:rPr>
     </w:lvl>
   </w:abstractNum>
-  <w:abstractNum w:abstractNumId="2" w15:restartNumberingAfterBreak="0">
+  <w:abstractNum w:abstractNumId="7" w15:restartNumberingAfterBreak="0">
+    <w:nsid w:val="580C11F9"/>
+    <w:multiLevelType w:val="multilevel"/>
+    <w:tmpl w:val="839A1868"/>
+    <w:lvl w:ilvl="0">
+      <w:start w:val="1"/>
+      <w:numFmt w:val="bullet"/>
+      <w:lvlText w:val=""/>
+      <w:lvlJc w:val="left"/>
+      <w:pPr>
+        <w:tabs>
+          <w:tab w:val="num" w:pos="720"/>
+        </w:tabs>
+        <w:ind w:left="720" w:hanging="360"/>
+      </w:pPr>
+      <w:rPr>
+        <w:rFonts w:ascii="Symbol" w:hAnsi="Symbol" w:hint="default"/>
+        <w:sz w:val="20"/>
+      </w:rPr>
+    </w:lvl>
+    <w:lvl w:ilvl="1" w:tentative="1">
+      <w:start w:val="1"/>
+      <w:numFmt w:val="bullet"/>
+      <w:lvlText w:val="o"/>
+      <w:lvlJc w:val="left"/>
+      <w:pPr>
+        <w:tabs>
+          <w:tab w:val="num" w:pos="1440"/>
+        </w:tabs>
+        <w:ind w:left="1440" w:hanging="360"/>
+      </w:pPr>
+      <w:rPr>
+        <w:rFonts w:ascii="Courier New" w:hAnsi="Courier New" w:hint="default"/>
+        <w:sz w:val="20"/>
+      </w:rPr>
+    </w:lvl>
+    <w:lvl w:ilvl="2" w:tentative="1">
+      <w:start w:val="1"/>
+      <w:numFmt w:val="bullet"/>
+      <w:lvlText w:val=""/>
+      <w:lvlJc w:val="left"/>
+      <w:pPr>
+        <w:tabs>
+          <w:tab w:val="num" w:pos="2160"/>
+        </w:tabs>
+        <w:ind w:left="2160" w:hanging="360"/>
+      </w:pPr>
+      <w:rPr>
+        <w:rFonts w:ascii="Wingdings" w:hAnsi="Wingdings" w:hint="default"/>
+        <w:sz w:val="20"/>
+      </w:rPr>
+    </w:lvl>
+    <w:lvl w:ilvl="3" w:tentative="1">
+      <w:start w:val="1"/>
+      <w:numFmt w:val="bullet"/>
+      <w:lvlText w:val=""/>
+      <w:lvlJc w:val="left"/>
+      <w:pPr>
+        <w:tabs>
+          <w:tab w:val="num" w:pos="2880"/>
+        </w:tabs>
+        <w:ind w:left="2880" w:hanging="360"/>
+      </w:pPr>
+      <w:rPr>
+        <w:rFonts w:ascii="Wingdings" w:hAnsi="Wingdings" w:hint="default"/>
+        <w:sz w:val="20"/>
+      </w:rPr>
+    </w:lvl>
+    <w:lvl w:ilvl="4" w:tentative="1">
+      <w:start w:val="1"/>
+      <w:numFmt w:val="bullet"/>
+      <w:lvlText w:val=""/>
+      <w:lvlJc w:val="left"/>
+      <w:pPr>
+        <w:tabs>
+          <w:tab w:val="num" w:pos="3600"/>
+        </w:tabs>
+        <w:ind w:left="3600" w:hanging="360"/>
+      </w:pPr>
+      <w:rPr>
+        <w:rFonts w:ascii="Wingdings" w:hAnsi="Wingdings" w:hint="default"/>
+        <w:sz w:val="20"/>
+      </w:rPr>
+    </w:lvl>
+    <w:lvl w:ilvl="5" w:tentative="1">
+      <w:start w:val="1"/>
+      <w:numFmt w:val="bullet"/>
+      <w:lvlText w:val=""/>
+      <w:lvlJc w:val="left"/>
+      <w:pPr>
+        <w:tabs>
+          <w:tab w:val="num" w:pos="4320"/>
+        </w:tabs>
+        <w:ind w:left="4320" w:hanging="360"/>
+      </w:pPr>
+      <w:rPr>
+        <w:rFonts w:ascii="Wingdings" w:hAnsi="Wingdings" w:hint="default"/>
+        <w:sz w:val="20"/>
+      </w:rPr>
+    </w:lvl>
+    <w:lvl w:ilvl="6" w:tentative="1">
+      <w:start w:val="1"/>
+      <w:numFmt w:val="bullet"/>
+      <w:lvlText w:val=""/>
+      <w:lvlJc w:val="left"/>
+      <w:pPr>
+        <w:tabs>
+          <w:tab w:val="num" w:pos="5040"/>
+        </w:tabs>
+        <w:ind w:left="5040" w:hanging="360"/>
+      </w:pPr>
+      <w:rPr>
+        <w:rFonts w:ascii="Wingdings" w:hAnsi="Wingdings" w:hint="default"/>
+        <w:sz w:val="20"/>
+      </w:rPr>
+    </w:lvl>
+    <w:lvl w:ilvl="7" w:tentative="1">
+      <w:start w:val="1"/>
+      <w:numFmt w:val="bullet"/>
+      <w:lvlText w:val=""/>
+      <w:lvlJc w:val="left"/>
+      <w:pPr>
+        <w:tabs>
+          <w:tab w:val="num" w:pos="5760"/>
+        </w:tabs>
+        <w:ind w:left="5760" w:hanging="360"/>
+      </w:pPr>
+      <w:rPr>
+        <w:rFonts w:ascii="Wingdings" w:hAnsi="Wingdings" w:hint="default"/>
+        <w:sz w:val="20"/>
+      </w:rPr>
+    </w:lvl>
+    <w:lvl w:ilvl="8" w:tentative="1">
+      <w:start w:val="1"/>
+      <w:numFmt w:val="bullet"/>
+      <w:lvlText w:val=""/>
+      <w:lvlJc w:val="left"/>
+      <w:pPr>
+        <w:tabs>
+          <w:tab w:val="num" w:pos="6480"/>
+        </w:tabs>
+        <w:ind w:left="6480" w:hanging="360"/>
+      </w:pPr>
+      <w:rPr>
+        <w:rFonts w:ascii="Wingdings" w:hAnsi="Wingdings" w:hint="default"/>
+        <w:sz w:val="20"/>
+      </w:rPr>
+    </w:lvl>
+  </w:abstractNum>
+  <w:abstractNum w:abstractNumId="8" w15:restartNumberingAfterBreak="0">
+    <w:nsid w:val="5FD6660C"/>
+    <w:multiLevelType w:val="hybridMultilevel"/>
+    <w:tmpl w:val="4B649AD4"/>
+    <w:lvl w:ilvl="0" w:tplc="040C0005">
+      <w:start w:val="1"/>
+      <w:numFmt w:val="bullet"/>
+      <w:lvlText w:val=""/>
+      <w:lvlJc w:val="left"/>
+      <w:pPr>
+        <w:ind w:left="720" w:hanging="360"/>
+      </w:pPr>
+      <w:rPr>
+        <w:rFonts w:ascii="Wingdings" w:hAnsi="Wingdings" w:hint="default"/>
+      </w:rPr>
+    </w:lvl>
+    <w:lvl w:ilvl="1" w:tplc="040C0003" w:tentative="1">
+      <w:start w:val="1"/>
+      <w:numFmt w:val="bullet"/>
+      <w:lvlText w:val="o"/>
+      <w:lvlJc w:val="left"/>
+      <w:pPr>
+        <w:ind w:left="1440" w:hanging="360"/>
+      </w:pPr>
+      <w:rPr>
+        <w:rFonts w:ascii="Courier New" w:hAnsi="Courier New" w:cs="Courier New" w:hint="default"/>
+      </w:rPr>
+    </w:lvl>
+    <w:lvl w:ilvl="2" w:tplc="040C0005" w:tentative="1">
+      <w:start w:val="1"/>
+      <w:numFmt w:val="bullet"/>
+      <w:lvlText w:val=""/>
+      <w:lvlJc w:val="left"/>
+      <w:pPr>
+        <w:ind w:left="2160" w:hanging="360"/>
+      </w:pPr>
+      <w:rPr>
+        <w:rFonts w:ascii="Wingdings" w:hAnsi="Wingdings" w:hint="default"/>
+      </w:rPr>
+    </w:lvl>
+    <w:lvl w:ilvl="3" w:tplc="040C0001" w:tentative="1">
+      <w:start w:val="1"/>
+      <w:numFmt w:val="bullet"/>
+      <w:lvlText w:val=""/>
+      <w:lvlJc w:val="left"/>
+      <w:pPr>
+        <w:ind w:left="2880" w:hanging="360"/>
+      </w:pPr>
+      <w:rPr>
+        <w:rFonts w:ascii="Symbol" w:hAnsi="Symbol" w:hint="default"/>
+      </w:rPr>
+    </w:lvl>
+    <w:lvl w:ilvl="4" w:tplc="040C0003" w:tentative="1">
+      <w:start w:val="1"/>
+      <w:numFmt w:val="bullet"/>
+      <w:lvlText w:val="o"/>
+      <w:lvlJc w:val="left"/>
+      <w:pPr>
+        <w:ind w:left="3600" w:hanging="360"/>
+      </w:pPr>
+      <w:rPr>
+        <w:rFonts w:ascii="Courier New" w:hAnsi="Courier New" w:cs="Courier New" w:hint="default"/>
+      </w:rPr>
+    </w:lvl>
+    <w:lvl w:ilvl="5" w:tplc="040C0005" w:tentative="1">
+      <w:start w:val="1"/>
+      <w:numFmt w:val="bullet"/>
+      <w:lvlText w:val=""/>
+      <w:lvlJc w:val="left"/>
+      <w:pPr>
+        <w:ind w:left="4320" w:hanging="360"/>
+      </w:pPr>
+      <w:rPr>
+        <w:rFonts w:ascii="Wingdings" w:hAnsi="Wingdings" w:hint="default"/>
+      </w:rPr>
+    </w:lvl>
+    <w:lvl w:ilvl="6" w:tplc="040C0001" w:tentative="1">
+      <w:start w:val="1"/>
+      <w:numFmt w:val="bullet"/>
+      <w:lvlText w:val=""/>
+      <w:lvlJc w:val="left"/>
+      <w:pPr>
+        <w:ind w:left="5040" w:hanging="360"/>
+      </w:pPr>
+      <w:rPr>
+        <w:rFonts w:ascii="Symbol" w:hAnsi="Symbol" w:hint="default"/>
+      </w:rPr>
+    </w:lvl>
+    <w:lvl w:ilvl="7" w:tplc="040C0003" w:tentative="1">
+      <w:start w:val="1"/>
+      <w:numFmt w:val="bullet"/>
+      <w:lvlText w:val="o"/>
+      <w:lvlJc w:val="left"/>
+      <w:pPr>
+        <w:ind w:left="5760" w:hanging="360"/>
+      </w:pPr>
+      <w:rPr>
+        <w:rFonts w:ascii="Courier New" w:hAnsi="Courier New" w:cs="Courier New" w:hint="default"/>
+      </w:rPr>
+    </w:lvl>
+    <w:lvl w:ilvl="8" w:tplc="040C0005" w:tentative="1">
+      <w:start w:val="1"/>
+      <w:numFmt w:val="bullet"/>
+      <w:lvlText w:val=""/>
+      <w:lvlJc w:val="left"/>
+      <w:pPr>
+        <w:ind w:left="6480" w:hanging="360"/>
+      </w:pPr>
+      <w:rPr>
+        <w:rFonts w:ascii="Wingdings" w:hAnsi="Wingdings" w:hint="default"/>
+      </w:rPr>
+    </w:lvl>
+  </w:abstractNum>
+  <w:abstractNum w:abstractNumId="9" w15:restartNumberingAfterBreak="0">
     <w:nsid w:val="6B450F4D"/>
     <w:multiLevelType w:val="multilevel"/>
     <w:tmpl w:val="8514CFAA"/>
@@ -1196,14 +2463,187 @@
       </w:rPr>
     </w:lvl>
   </w:abstractNum>
+  <w:abstractNum w:abstractNumId="10" w15:restartNumberingAfterBreak="0">
+    <w:nsid w:val="756444A4"/>
+    <w:multiLevelType w:val="multilevel"/>
+    <w:tmpl w:val="1DF0EF0E"/>
+    <w:lvl w:ilvl="0">
+      <w:start w:val="1"/>
+      <w:numFmt w:val="bullet"/>
+      <w:lvlText w:val=""/>
+      <w:lvlJc w:val="left"/>
+      <w:pPr>
+        <w:tabs>
+          <w:tab w:val="num" w:pos="720"/>
+        </w:tabs>
+        <w:ind w:left="720" w:hanging="360"/>
+      </w:pPr>
+      <w:rPr>
+        <w:rFonts w:ascii="Symbol" w:hAnsi="Symbol" w:hint="default"/>
+        <w:sz w:val="20"/>
+      </w:rPr>
+    </w:lvl>
+    <w:lvl w:ilvl="1" w:tentative="1">
+      <w:start w:val="1"/>
+      <w:numFmt w:val="bullet"/>
+      <w:lvlText w:val="o"/>
+      <w:lvlJc w:val="left"/>
+      <w:pPr>
+        <w:tabs>
+          <w:tab w:val="num" w:pos="1440"/>
+        </w:tabs>
+        <w:ind w:left="1440" w:hanging="360"/>
+      </w:pPr>
+      <w:rPr>
+        <w:rFonts w:ascii="Courier New" w:hAnsi="Courier New" w:hint="default"/>
+        <w:sz w:val="20"/>
+      </w:rPr>
+    </w:lvl>
+    <w:lvl w:ilvl="2" w:tentative="1">
+      <w:start w:val="1"/>
+      <w:numFmt w:val="bullet"/>
+      <w:lvlText w:val=""/>
+      <w:lvlJc w:val="left"/>
+      <w:pPr>
+        <w:tabs>
+          <w:tab w:val="num" w:pos="2160"/>
+        </w:tabs>
+        <w:ind w:left="2160" w:hanging="360"/>
+      </w:pPr>
+      <w:rPr>
+        <w:rFonts w:ascii="Wingdings" w:hAnsi="Wingdings" w:hint="default"/>
+        <w:sz w:val="20"/>
+      </w:rPr>
+    </w:lvl>
+    <w:lvl w:ilvl="3" w:tentative="1">
+      <w:start w:val="1"/>
+      <w:numFmt w:val="bullet"/>
+      <w:lvlText w:val=""/>
+      <w:lvlJc w:val="left"/>
+      <w:pPr>
+        <w:tabs>
+          <w:tab w:val="num" w:pos="2880"/>
+        </w:tabs>
+        <w:ind w:left="2880" w:hanging="360"/>
+      </w:pPr>
+      <w:rPr>
+        <w:rFonts w:ascii="Wingdings" w:hAnsi="Wingdings" w:hint="default"/>
+        <w:sz w:val="20"/>
+      </w:rPr>
+    </w:lvl>
+    <w:lvl w:ilvl="4" w:tentative="1">
+      <w:start w:val="1"/>
+      <w:numFmt w:val="bullet"/>
+      <w:lvlText w:val=""/>
+      <w:lvlJc w:val="left"/>
+      <w:pPr>
+        <w:tabs>
+          <w:tab w:val="num" w:pos="3600"/>
+        </w:tabs>
+        <w:ind w:left="3600" w:hanging="360"/>
+      </w:pPr>
+      <w:rPr>
+        <w:rFonts w:ascii="Wingdings" w:hAnsi="Wingdings" w:hint="default"/>
+        <w:sz w:val="20"/>
+      </w:rPr>
+    </w:lvl>
+    <w:lvl w:ilvl="5" w:tentative="1">
+      <w:start w:val="1"/>
+      <w:numFmt w:val="bullet"/>
+      <w:lvlText w:val=""/>
+      <w:lvlJc w:val="left"/>
+      <w:pPr>
+        <w:tabs>
+          <w:tab w:val="num" w:pos="4320"/>
+        </w:tabs>
+        <w:ind w:left="4320" w:hanging="360"/>
+      </w:pPr>
+      <w:rPr>
+        <w:rFonts w:ascii="Wingdings" w:hAnsi="Wingdings" w:hint="default"/>
+        <w:sz w:val="20"/>
+      </w:rPr>
+    </w:lvl>
+    <w:lvl w:ilvl="6" w:tentative="1">
+      <w:start w:val="1"/>
+      <w:numFmt w:val="bullet"/>
+      <w:lvlText w:val=""/>
+      <w:lvlJc w:val="left"/>
+      <w:pPr>
+        <w:tabs>
+          <w:tab w:val="num" w:pos="5040"/>
+        </w:tabs>
+        <w:ind w:left="5040" w:hanging="360"/>
+      </w:pPr>
+      <w:rPr>
+        <w:rFonts w:ascii="Wingdings" w:hAnsi="Wingdings" w:hint="default"/>
+        <w:sz w:val="20"/>
+      </w:rPr>
+    </w:lvl>
+    <w:lvl w:ilvl="7" w:tentative="1">
+      <w:start w:val="1"/>
+      <w:numFmt w:val="bullet"/>
+      <w:lvlText w:val=""/>
+      <w:lvlJc w:val="left"/>
+      <w:pPr>
+        <w:tabs>
+          <w:tab w:val="num" w:pos="5760"/>
+        </w:tabs>
+        <w:ind w:left="5760" w:hanging="360"/>
+      </w:pPr>
+      <w:rPr>
+        <w:rFonts w:ascii="Wingdings" w:hAnsi="Wingdings" w:hint="default"/>
+        <w:sz w:val="20"/>
+      </w:rPr>
+    </w:lvl>
+    <w:lvl w:ilvl="8" w:tentative="1">
+      <w:start w:val="1"/>
+      <w:numFmt w:val="bullet"/>
+      <w:lvlText w:val=""/>
+      <w:lvlJc w:val="left"/>
+      <w:pPr>
+        <w:tabs>
+          <w:tab w:val="num" w:pos="6480"/>
+        </w:tabs>
+        <w:ind w:left="6480" w:hanging="360"/>
+      </w:pPr>
+      <w:rPr>
+        <w:rFonts w:ascii="Wingdings" w:hAnsi="Wingdings" w:hint="default"/>
+        <w:sz w:val="20"/>
+      </w:rPr>
+    </w:lvl>
+  </w:abstractNum>
   <w:num w:numId="1" w16cid:durableId="869487218">
+    <w:abstractNumId w:val="9"/>
+  </w:num>
+  <w:num w:numId="2" w16cid:durableId="969288471">
     <w:abstractNumId w:val="2"/>
   </w:num>
-  <w:num w:numId="2" w16cid:durableId="969288471">
+  <w:num w:numId="3" w16cid:durableId="525558676">
+    <w:abstractNumId w:val="6"/>
+  </w:num>
+  <w:num w:numId="4" w16cid:durableId="970863669">
+    <w:abstractNumId w:val="10"/>
+  </w:num>
+  <w:num w:numId="5" w16cid:durableId="1589852350">
     <w:abstractNumId w:val="0"/>
   </w:num>
-  <w:num w:numId="3" w16cid:durableId="525558676">
+  <w:num w:numId="6" w16cid:durableId="837772510">
     <w:abstractNumId w:val="1"/>
+  </w:num>
+  <w:num w:numId="7" w16cid:durableId="1586375687">
+    <w:abstractNumId w:val="7"/>
+  </w:num>
+  <w:num w:numId="8" w16cid:durableId="1574508269">
+    <w:abstractNumId w:val="4"/>
+  </w:num>
+  <w:num w:numId="9" w16cid:durableId="362941372">
+    <w:abstractNumId w:val="3"/>
+  </w:num>
+  <w:num w:numId="10" w16cid:durableId="1083601181">
+    <w:abstractNumId w:val="5"/>
+  </w:num>
+  <w:num w:numId="11" w16cid:durableId="1171335152">
+    <w:abstractNumId w:val="8"/>
   </w:num>
 </w:numbering>
 </file>

</xml_diff>